<commit_message>
v0.97 — o caminho de pulada do conferir-atributos quebrava sem python-docx, e tres validadores estao cegos nessa maquina
</commit_message>
<xml_diff>
--- a/manual/Fundamento-MANUAL-v7.docx
+++ b/manual/Fundamento-MANUAL-v7.docx
@@ -70,7 +70,7 @@
           <w:sz w:val="20"/>
           <w:szCs w:val="20"/>
         </w:rPr>
-        <w:t xml:space="preserve">Níveis 1–20  ·  Faixa lendária 21–30  ·  Versão 7.8</w:t>
+        <w:t xml:space="preserve">Níveis 1–20  ·  Faixa lendária 21–30  ·  Versão 7.9</w:t>
       </w:r>
     </w:p>
     <w:p>
@@ -24430,7 +24430,7 @@
                 <w:sz w:val="19"/>
                 <w:szCs w:val="19"/>
               </w:rPr>
-              <w:t xml:space="preserve">Aplica uma: Derrubado, Lento, Cego, Agarrado, Surdo, Desarmado ou Calado (o alvo não conjura). Dura uma rodada.</w:t>
+              <w:t xml:space="preserve">Aplica uma: Derrubado, Cego, Surdo, Agarrado, Impedido, Envenenado, Lento, Desarmado ou Calado (o alvo não conjura). Dura uma rodada.</w:t>
             </w:r>
           </w:p>
         </w:tc>
@@ -24522,7 +24522,7 @@
                 <w:sz w:val="19"/>
                 <w:szCs w:val="19"/>
               </w:rPr>
-              <w:t xml:space="preserve">Aplica uma: Atordoado, Paralisado, Amedrontado, Enfeitiçado ou Incapacitado. Dura uma rodada, com Teste de Resistência no fim de cada turno do alvo. Uma por feitiço.</w:t>
+              <w:t xml:space="preserve">Aplica uma: Amedrontado, Enfeitiçado, Atordoado, Incapacitado ou Petrificado. Dura uma rodada, com Teste de Resistência no fim de cada turno do alvo. Uma por feitiço.</w:t>
             </w:r>
           </w:p>
         </w:tc>
@@ -25066,6 +25066,1263 @@
                 <w:szCs w:val="19"/>
               </w:rPr>
               <w:t xml:space="preserve">Cancela um efeito contínuo ou uma barreira de Classe igual ou menor que o seu.</w:t>
+            </w:r>
+          </w:p>
+        </w:tc>
+      </w:tr>
+    </w:tbl>
+    <w:p>
+      <w:pPr>
+        <w:pStyle w:val="Heading2"/>
+        <w:spacing w:after="160" w:before="340"/>
+      </w:pPr>
+      <w:r>
+        <w:rPr>
+          <w:rFonts w:ascii="Georgia" w:cs="Georgia" w:eastAsia="Georgia" w:hAnsi="Georgia"/>
+          <w:b/>
+          <w:bCs/>
+          <w:color w:val="741B47"/>
+          <w:sz w:val="28"/>
+          <w:szCs w:val="28"/>
+        </w:rPr>
+        <w:t xml:space="preserve">As condições, uma a uma</w:t>
+      </w:r>
+    </w:p>
+    <w:p>
+      <w:pPr>
+        <w:spacing w:after="140" w:before="0" w:line="276"/>
+      </w:pPr>
+      <w:r>
+        <w:t xml:space="preserve">As doze da lista acima nunca tiveram efeito escrito, e três novas entraram. Aqui está o que cada uma faz. </w:t>
+      </w:r>
+      <w:r>
+        <w:rPr>
+          <w:b/>
+          <w:bCs/>
+        </w:rPr>
+        <w:t xml:space="preserve">Uma condição dura uma rodada</w:t>
+      </w:r>
+      <w:r>
+        <w:t xml:space="preserve">, como as linhas de Controle já diziam.</w:t>
+      </w:r>
+    </w:p>
+    <w:tbl>
+      <w:tblPr>
+        <w:tblW w:type="dxa" w:w="9000"/>
+        <w:tblBorders>
+          <w:top w:val="single" w:color="C8C8C8" w:sz="4"/>
+          <w:left w:val="single" w:color="C8C8C8" w:sz="4"/>
+          <w:bottom w:val="single" w:color="C8C8C8" w:sz="4"/>
+          <w:right w:val="single" w:color="C8C8C8" w:sz="4"/>
+          <w:insideH w:val="single" w:color="C8C8C8" w:sz="2"/>
+          <w:insideV w:val="single" w:color="C8C8C8" w:sz="2"/>
+        </w:tblBorders>
+      </w:tblPr>
+      <w:tblGrid>
+        <w:gridCol w:w="2200"/>
+        <w:gridCol w:w="6800"/>
+      </w:tblGrid>
+      <w:tr>
+        <w:trPr>
+          <w:cantSplit/>
+          <w:tblHeader/>
+        </w:trPr>
+        <w:tc>
+          <w:tcPr>
+            <w:tcW w:type="dxa" w:w="2200"/>
+            <w:shd w:fill="4E1230" w:color="auto" w:val="clear"/>
+            <w:tcMar>
+              <w:top w:type="dxa" w:w="60"/>
+              <w:left w:type="dxa" w:w="110"/>
+              <w:bottom w:type="dxa" w:w="60"/>
+              <w:right w:type="dxa" w:w="110"/>
+            </w:tcMar>
+            <w:vAlign w:val="center"/>
+          </w:tcPr>
+          <w:p>
+            <w:pPr>
+              <w:spacing w:after="40" w:before="40" w:line="240"/>
+              <w:jc w:val="left"/>
+            </w:pPr>
+            <w:r>
+              <w:rPr>
+                <w:b/>
+                <w:bCs/>
+                <w:color w:val="FFFFFF"/>
+                <w:sz w:val="18"/>
+                <w:szCs w:val="18"/>
+              </w:rPr>
+              <w:t xml:space="preserve">Menor</w:t>
+            </w:r>
+          </w:p>
+        </w:tc>
+        <w:tc>
+          <w:tcPr>
+            <w:tcW w:type="dxa" w:w="6800"/>
+            <w:shd w:fill="4E1230" w:color="auto" w:val="clear"/>
+            <w:tcMar>
+              <w:top w:type="dxa" w:w="60"/>
+              <w:left w:type="dxa" w:w="110"/>
+              <w:bottom w:type="dxa" w:w="60"/>
+              <w:right w:type="dxa" w:w="110"/>
+            </w:tcMar>
+            <w:vAlign w:val="center"/>
+          </w:tcPr>
+          <w:p>
+            <w:pPr>
+              <w:spacing w:after="40" w:before="40" w:line="240"/>
+              <w:jc w:val="center"/>
+            </w:pPr>
+            <w:r>
+              <w:rPr>
+                <w:b/>
+                <w:bCs/>
+                <w:color w:val="FFFFFF"/>
+                <w:sz w:val="18"/>
+                <w:szCs w:val="18"/>
+              </w:rPr>
+              <w:t xml:space="preserve">O que faz</w:t>
+            </w:r>
+          </w:p>
+        </w:tc>
+      </w:tr>
+      <w:tr>
+        <w:trPr>
+          <w:cantSplit/>
+        </w:trPr>
+        <w:tc>
+          <w:tcPr>
+            <w:tcW w:type="dxa" w:w="2200"/>
+            <w:tcMar>
+              <w:top w:type="dxa" w:w="60"/>
+              <w:left w:type="dxa" w:w="110"/>
+              <w:bottom w:type="dxa" w:w="60"/>
+              <w:right w:type="dxa" w:w="110"/>
+            </w:tcMar>
+            <w:vAlign w:val="center"/>
+          </w:tcPr>
+          <w:p>
+            <w:pPr>
+              <w:spacing w:after="40" w:before="40" w:line="240"/>
+              <w:jc w:val="left"/>
+            </w:pPr>
+            <w:r>
+              <w:rPr>
+                <w:b/>
+                <w:bCs/>
+                <w:color w:val="1A1A1A"/>
+                <w:sz w:val="19"/>
+                <w:szCs w:val="19"/>
+              </w:rPr>
+              <w:t xml:space="preserve">Derrubado</w:t>
+            </w:r>
+          </w:p>
+        </w:tc>
+        <w:tc>
+          <w:tcPr>
+            <w:tcW w:type="dxa" w:w="6800"/>
+            <w:tcMar>
+              <w:top w:type="dxa" w:w="60"/>
+              <w:left w:type="dxa" w:w="110"/>
+              <w:bottom w:type="dxa" w:w="60"/>
+              <w:right w:type="dxa" w:w="110"/>
+            </w:tcMar>
+            <w:vAlign w:val="center"/>
+          </w:tcPr>
+          <w:p>
+            <w:pPr>
+              <w:spacing w:after="40" w:before="40" w:line="240"/>
+              <w:jc w:val="left"/>
+            </w:pPr>
+            <w:r>
+              <w:rPr>
+                <w:b w:val="false"/>
+                <w:bCs w:val="false"/>
+                <w:color w:val="1A1A1A"/>
+                <w:sz w:val="19"/>
+                <w:szCs w:val="19"/>
+              </w:rPr>
+              <w:t xml:space="preserve">No chão. Só se move rastejando, desvantagem nos seus ataques, e quem ataca de até 1,5 m tem vantagem — de longe, desvantagem.</w:t>
+            </w:r>
+          </w:p>
+        </w:tc>
+      </w:tr>
+      <w:tr>
+        <w:trPr>
+          <w:cantSplit/>
+        </w:trPr>
+        <w:tc>
+          <w:tcPr>
+            <w:tcW w:type="dxa" w:w="2200"/>
+            <w:shd w:fill="F7F4F6" w:color="auto" w:val="clear"/>
+            <w:tcMar>
+              <w:top w:type="dxa" w:w="60"/>
+              <w:left w:type="dxa" w:w="110"/>
+              <w:bottom w:type="dxa" w:w="60"/>
+              <w:right w:type="dxa" w:w="110"/>
+            </w:tcMar>
+            <w:vAlign w:val="center"/>
+          </w:tcPr>
+          <w:p>
+            <w:pPr>
+              <w:spacing w:after="40" w:before="40" w:line="240"/>
+              <w:jc w:val="left"/>
+            </w:pPr>
+            <w:r>
+              <w:rPr>
+                <w:b/>
+                <w:bCs/>
+                <w:color w:val="1A1A1A"/>
+                <w:sz w:val="19"/>
+                <w:szCs w:val="19"/>
+              </w:rPr>
+              <w:t xml:space="preserve">Cego</w:t>
+            </w:r>
+          </w:p>
+        </w:tc>
+        <w:tc>
+          <w:tcPr>
+            <w:tcW w:type="dxa" w:w="6800"/>
+            <w:shd w:fill="F7F4F6" w:color="auto" w:val="clear"/>
+            <w:tcMar>
+              <w:top w:type="dxa" w:w="60"/>
+              <w:left w:type="dxa" w:w="110"/>
+              <w:bottom w:type="dxa" w:w="60"/>
+              <w:right w:type="dxa" w:w="110"/>
+            </w:tcMar>
+            <w:vAlign w:val="center"/>
+          </w:tcPr>
+          <w:p>
+            <w:pPr>
+              <w:spacing w:after="40" w:before="40" w:line="240"/>
+              <w:jc w:val="left"/>
+            </w:pPr>
+            <w:r>
+              <w:rPr>
+                <w:b w:val="false"/>
+                <w:bCs w:val="false"/>
+                <w:color w:val="1A1A1A"/>
+                <w:sz w:val="19"/>
+                <w:szCs w:val="19"/>
+              </w:rPr>
+              <w:t xml:space="preserve">Não enxerga. Falha automático em teste que precise de vista, desvantagem nos seus ataques, vantagem para quem te ataca.</w:t>
+            </w:r>
+          </w:p>
+        </w:tc>
+      </w:tr>
+      <w:tr>
+        <w:trPr>
+          <w:cantSplit/>
+        </w:trPr>
+        <w:tc>
+          <w:tcPr>
+            <w:tcW w:type="dxa" w:w="2200"/>
+            <w:tcMar>
+              <w:top w:type="dxa" w:w="60"/>
+              <w:left w:type="dxa" w:w="110"/>
+              <w:bottom w:type="dxa" w:w="60"/>
+              <w:right w:type="dxa" w:w="110"/>
+            </w:tcMar>
+            <w:vAlign w:val="center"/>
+          </w:tcPr>
+          <w:p>
+            <w:pPr>
+              <w:spacing w:after="40" w:before="40" w:line="240"/>
+              <w:jc w:val="left"/>
+            </w:pPr>
+            <w:r>
+              <w:rPr>
+                <w:b/>
+                <w:bCs/>
+                <w:color w:val="1A1A1A"/>
+                <w:sz w:val="19"/>
+                <w:szCs w:val="19"/>
+              </w:rPr>
+              <w:t xml:space="preserve">Surdo</w:t>
+            </w:r>
+          </w:p>
+        </w:tc>
+        <w:tc>
+          <w:tcPr>
+            <w:tcW w:type="dxa" w:w="6800"/>
+            <w:tcMar>
+              <w:top w:type="dxa" w:w="60"/>
+              <w:left w:type="dxa" w:w="110"/>
+              <w:bottom w:type="dxa" w:w="60"/>
+              <w:right w:type="dxa" w:w="110"/>
+            </w:tcMar>
+            <w:vAlign w:val="center"/>
+          </w:tcPr>
+          <w:p>
+            <w:pPr>
+              <w:spacing w:after="40" w:before="40" w:line="240"/>
+              <w:jc w:val="left"/>
+            </w:pPr>
+            <w:r>
+              <w:rPr>
+                <w:b w:val="false"/>
+                <w:bCs w:val="false"/>
+                <w:color w:val="1A1A1A"/>
+                <w:sz w:val="19"/>
+                <w:szCs w:val="19"/>
+              </w:rPr>
+              <w:t xml:space="preserve">Não ouve. Falha automático em teste que precise de audição.</w:t>
+            </w:r>
+          </w:p>
+        </w:tc>
+      </w:tr>
+      <w:tr>
+        <w:trPr>
+          <w:cantSplit/>
+        </w:trPr>
+        <w:tc>
+          <w:tcPr>
+            <w:tcW w:type="dxa" w:w="2200"/>
+            <w:shd w:fill="F7F4F6" w:color="auto" w:val="clear"/>
+            <w:tcMar>
+              <w:top w:type="dxa" w:w="60"/>
+              <w:left w:type="dxa" w:w="110"/>
+              <w:bottom w:type="dxa" w:w="60"/>
+              <w:right w:type="dxa" w:w="110"/>
+            </w:tcMar>
+            <w:vAlign w:val="center"/>
+          </w:tcPr>
+          <w:p>
+            <w:pPr>
+              <w:spacing w:after="40" w:before="40" w:line="240"/>
+              <w:jc w:val="left"/>
+            </w:pPr>
+            <w:r>
+              <w:rPr>
+                <w:b/>
+                <w:bCs/>
+                <w:color w:val="1A1A1A"/>
+                <w:sz w:val="19"/>
+                <w:szCs w:val="19"/>
+              </w:rPr>
+              <w:t xml:space="preserve">Agarrado</w:t>
+            </w:r>
+          </w:p>
+        </w:tc>
+        <w:tc>
+          <w:tcPr>
+            <w:tcW w:type="dxa" w:w="6800"/>
+            <w:shd w:fill="F7F4F6" w:color="auto" w:val="clear"/>
+            <w:tcMar>
+              <w:top w:type="dxa" w:w="60"/>
+              <w:left w:type="dxa" w:w="110"/>
+              <w:bottom w:type="dxa" w:w="60"/>
+              <w:right w:type="dxa" w:w="110"/>
+            </w:tcMar>
+            <w:vAlign w:val="center"/>
+          </w:tcPr>
+          <w:p>
+            <w:pPr>
+              <w:spacing w:after="40" w:before="40" w:line="240"/>
+              <w:jc w:val="left"/>
+            </w:pPr>
+            <w:r>
+              <w:rPr>
+                <w:b w:val="false"/>
+                <w:bCs w:val="false"/>
+                <w:color w:val="1A1A1A"/>
+                <w:sz w:val="19"/>
+                <w:szCs w:val="19"/>
+              </w:rPr>
+              <w:t xml:space="preserve">Deslocamento 0. Acaba se quem agarrou ficar Incapacitado, ou se algo te tirar do alcance dele.</w:t>
+            </w:r>
+          </w:p>
+        </w:tc>
+      </w:tr>
+      <w:tr>
+        <w:trPr>
+          <w:cantSplit/>
+        </w:trPr>
+        <w:tc>
+          <w:tcPr>
+            <w:tcW w:type="dxa" w:w="2200"/>
+            <w:tcMar>
+              <w:top w:type="dxa" w:w="60"/>
+              <w:left w:type="dxa" w:w="110"/>
+              <w:bottom w:type="dxa" w:w="60"/>
+              <w:right w:type="dxa" w:w="110"/>
+            </w:tcMar>
+            <w:vAlign w:val="center"/>
+          </w:tcPr>
+          <w:p>
+            <w:pPr>
+              <w:spacing w:after="40" w:before="40" w:line="240"/>
+              <w:jc w:val="left"/>
+            </w:pPr>
+            <w:r>
+              <w:rPr>
+                <w:b/>
+                <w:bCs/>
+                <w:color w:val="1A1A1A"/>
+                <w:sz w:val="19"/>
+                <w:szCs w:val="19"/>
+              </w:rPr>
+              <w:t xml:space="preserve">Impedido</w:t>
+            </w:r>
+          </w:p>
+        </w:tc>
+        <w:tc>
+          <w:tcPr>
+            <w:tcW w:type="dxa" w:w="6800"/>
+            <w:tcMar>
+              <w:top w:type="dxa" w:w="60"/>
+              <w:left w:type="dxa" w:w="110"/>
+              <w:bottom w:type="dxa" w:w="60"/>
+              <w:right w:type="dxa" w:w="110"/>
+            </w:tcMar>
+            <w:vAlign w:val="center"/>
+          </w:tcPr>
+          <w:p>
+            <w:pPr>
+              <w:spacing w:after="40" w:before="40" w:line="240"/>
+              <w:jc w:val="left"/>
+            </w:pPr>
+            <w:r>
+              <w:rPr>
+                <w:b w:val="false"/>
+                <w:bCs w:val="false"/>
+                <w:color w:val="1A1A1A"/>
+                <w:sz w:val="19"/>
+                <w:szCs w:val="19"/>
+              </w:rPr>
+              <w:t xml:space="preserve">Deslocamento 0, desvantagem nos seus ataques e no Teste de Resistência Físico, e vantagem para quem te ataca.</w:t>
+            </w:r>
+          </w:p>
+        </w:tc>
+      </w:tr>
+      <w:tr>
+        <w:trPr>
+          <w:cantSplit/>
+        </w:trPr>
+        <w:tc>
+          <w:tcPr>
+            <w:tcW w:type="dxa" w:w="2200"/>
+            <w:shd w:fill="F7F4F6" w:color="auto" w:val="clear"/>
+            <w:tcMar>
+              <w:top w:type="dxa" w:w="60"/>
+              <w:left w:type="dxa" w:w="110"/>
+              <w:bottom w:type="dxa" w:w="60"/>
+              <w:right w:type="dxa" w:w="110"/>
+            </w:tcMar>
+            <w:vAlign w:val="center"/>
+          </w:tcPr>
+          <w:p>
+            <w:pPr>
+              <w:spacing w:after="40" w:before="40" w:line="240"/>
+              <w:jc w:val="left"/>
+            </w:pPr>
+            <w:r>
+              <w:rPr>
+                <w:b/>
+                <w:bCs/>
+                <w:color w:val="1A1A1A"/>
+                <w:sz w:val="19"/>
+                <w:szCs w:val="19"/>
+              </w:rPr>
+              <w:t xml:space="preserve">Envenenado</w:t>
+            </w:r>
+          </w:p>
+        </w:tc>
+        <w:tc>
+          <w:tcPr>
+            <w:tcW w:type="dxa" w:w="6800"/>
+            <w:shd w:fill="F7F4F6" w:color="auto" w:val="clear"/>
+            <w:tcMar>
+              <w:top w:type="dxa" w:w="60"/>
+              <w:left w:type="dxa" w:w="110"/>
+              <w:bottom w:type="dxa" w:w="60"/>
+              <w:right w:type="dxa" w:w="110"/>
+            </w:tcMar>
+            <w:vAlign w:val="center"/>
+          </w:tcPr>
+          <w:p>
+            <w:pPr>
+              <w:spacing w:after="40" w:before="40" w:line="240"/>
+              <w:jc w:val="left"/>
+            </w:pPr>
+            <w:r>
+              <w:rPr>
+                <w:b w:val="false"/>
+                <w:bCs w:val="false"/>
+                <w:color w:val="1A1A1A"/>
+                <w:sz w:val="19"/>
+                <w:szCs w:val="19"/>
+              </w:rPr>
+              <w:t xml:space="preserve">Desvantagem nos seus ataques e em todo teste de perícia.</w:t>
+            </w:r>
+          </w:p>
+        </w:tc>
+      </w:tr>
+      <w:tr>
+        <w:trPr>
+          <w:cantSplit/>
+        </w:trPr>
+        <w:tc>
+          <w:tcPr>
+            <w:tcW w:type="dxa" w:w="2200"/>
+            <w:tcMar>
+              <w:top w:type="dxa" w:w="60"/>
+              <w:left w:type="dxa" w:w="110"/>
+              <w:bottom w:type="dxa" w:w="60"/>
+              <w:right w:type="dxa" w:w="110"/>
+            </w:tcMar>
+            <w:vAlign w:val="center"/>
+          </w:tcPr>
+          <w:p>
+            <w:pPr>
+              <w:spacing w:after="40" w:before="40" w:line="240"/>
+              <w:jc w:val="left"/>
+            </w:pPr>
+            <w:r>
+              <w:rPr>
+                <w:b/>
+                <w:bCs/>
+                <w:color w:val="1A1A1A"/>
+                <w:sz w:val="19"/>
+                <w:szCs w:val="19"/>
+              </w:rPr>
+              <w:t xml:space="preserve">Lento</w:t>
+            </w:r>
+          </w:p>
+        </w:tc>
+        <w:tc>
+          <w:tcPr>
+            <w:tcW w:type="dxa" w:w="6800"/>
+            <w:tcMar>
+              <w:top w:type="dxa" w:w="60"/>
+              <w:left w:type="dxa" w:w="110"/>
+              <w:bottom w:type="dxa" w:w="60"/>
+              <w:right w:type="dxa" w:w="110"/>
+            </w:tcMar>
+            <w:vAlign w:val="center"/>
+          </w:tcPr>
+          <w:p>
+            <w:pPr>
+              <w:spacing w:after="40" w:before="40" w:line="240"/>
+              <w:jc w:val="left"/>
+            </w:pPr>
+            <w:r>
+              <w:rPr>
+                <w:b w:val="false"/>
+                <w:bCs w:val="false"/>
+                <w:color w:val="1A1A1A"/>
+                <w:sz w:val="19"/>
+                <w:szCs w:val="19"/>
+              </w:rPr>
+              <w:t xml:space="preserve">Deslocamento pela metade, e sem Ação Bônus.</w:t>
+            </w:r>
+          </w:p>
+        </w:tc>
+      </w:tr>
+      <w:tr>
+        <w:trPr>
+          <w:cantSplit/>
+        </w:trPr>
+        <w:tc>
+          <w:tcPr>
+            <w:tcW w:type="dxa" w:w="2200"/>
+            <w:shd w:fill="F7F4F6" w:color="auto" w:val="clear"/>
+            <w:tcMar>
+              <w:top w:type="dxa" w:w="60"/>
+              <w:left w:type="dxa" w:w="110"/>
+              <w:bottom w:type="dxa" w:w="60"/>
+              <w:right w:type="dxa" w:w="110"/>
+            </w:tcMar>
+            <w:vAlign w:val="center"/>
+          </w:tcPr>
+          <w:p>
+            <w:pPr>
+              <w:spacing w:after="40" w:before="40" w:line="240"/>
+              <w:jc w:val="left"/>
+            </w:pPr>
+            <w:r>
+              <w:rPr>
+                <w:b/>
+                <w:bCs/>
+                <w:color w:val="1A1A1A"/>
+                <w:sz w:val="19"/>
+                <w:szCs w:val="19"/>
+              </w:rPr>
+              <w:t xml:space="preserve">Desarmado</w:t>
+            </w:r>
+          </w:p>
+        </w:tc>
+        <w:tc>
+          <w:tcPr>
+            <w:tcW w:type="dxa" w:w="6800"/>
+            <w:shd w:fill="F7F4F6" w:color="auto" w:val="clear"/>
+            <w:tcMar>
+              <w:top w:type="dxa" w:w="60"/>
+              <w:left w:type="dxa" w:w="110"/>
+              <w:bottom w:type="dxa" w:w="60"/>
+              <w:right w:type="dxa" w:w="110"/>
+            </w:tcMar>
+            <w:vAlign w:val="center"/>
+          </w:tcPr>
+          <w:p>
+            <w:pPr>
+              <w:spacing w:after="40" w:before="40" w:line="240"/>
+              <w:jc w:val="left"/>
+            </w:pPr>
+            <w:r>
+              <w:rPr>
+                <w:b w:val="false"/>
+                <w:bCs w:val="false"/>
+                <w:color w:val="1A1A1A"/>
+                <w:sz w:val="19"/>
+                <w:szCs w:val="19"/>
+              </w:rPr>
+              <w:t xml:space="preserve">A sua arma está no chão ou na mão de outro. Você bate desarmado até pegar de volta.</w:t>
+            </w:r>
+          </w:p>
+        </w:tc>
+      </w:tr>
+      <w:tr>
+        <w:trPr>
+          <w:cantSplit/>
+        </w:trPr>
+        <w:tc>
+          <w:tcPr>
+            <w:tcW w:type="dxa" w:w="2200"/>
+            <w:tcMar>
+              <w:top w:type="dxa" w:w="60"/>
+              <w:left w:type="dxa" w:w="110"/>
+              <w:bottom w:type="dxa" w:w="60"/>
+              <w:right w:type="dxa" w:w="110"/>
+            </w:tcMar>
+            <w:vAlign w:val="center"/>
+          </w:tcPr>
+          <w:p>
+            <w:pPr>
+              <w:spacing w:after="40" w:before="40" w:line="240"/>
+              <w:jc w:val="left"/>
+            </w:pPr>
+            <w:r>
+              <w:rPr>
+                <w:b/>
+                <w:bCs/>
+                <w:color w:val="1A1A1A"/>
+                <w:sz w:val="19"/>
+                <w:szCs w:val="19"/>
+              </w:rPr>
+              <w:t xml:space="preserve">Calado</w:t>
+            </w:r>
+          </w:p>
+        </w:tc>
+        <w:tc>
+          <w:tcPr>
+            <w:tcW w:type="dxa" w:w="6800"/>
+            <w:tcMar>
+              <w:top w:type="dxa" w:w="60"/>
+              <w:left w:type="dxa" w:w="110"/>
+              <w:bottom w:type="dxa" w:w="60"/>
+              <w:right w:type="dxa" w:w="110"/>
+            </w:tcMar>
+            <w:vAlign w:val="center"/>
+          </w:tcPr>
+          <w:p>
+            <w:pPr>
+              <w:spacing w:after="40" w:before="40" w:line="240"/>
+              <w:jc w:val="left"/>
+            </w:pPr>
+            <w:r>
+              <w:rPr>
+                <w:b w:val="false"/>
+                <w:bCs w:val="false"/>
+                <w:color w:val="1A1A1A"/>
+                <w:sz w:val="19"/>
+                <w:szCs w:val="19"/>
+              </w:rPr>
+              <w:t xml:space="preserve">Você não conjura. Nada que precise de voz, gesto ou Selo sai.</w:t>
+            </w:r>
+          </w:p>
+        </w:tc>
+      </w:tr>
+    </w:tbl>
+    <w:tbl>
+      <w:tblPr>
+        <w:tblW w:type="dxa" w:w="9000"/>
+        <w:tblBorders>
+          <w:top w:val="single" w:color="C8C8C8" w:sz="4"/>
+          <w:left w:val="single" w:color="C8C8C8" w:sz="4"/>
+          <w:bottom w:val="single" w:color="C8C8C8" w:sz="4"/>
+          <w:right w:val="single" w:color="C8C8C8" w:sz="4"/>
+          <w:insideH w:val="single" w:color="C8C8C8" w:sz="2"/>
+          <w:insideV w:val="single" w:color="C8C8C8" w:sz="2"/>
+        </w:tblBorders>
+      </w:tblPr>
+      <w:tblGrid>
+        <w:gridCol w:w="2200"/>
+        <w:gridCol w:w="6800"/>
+      </w:tblGrid>
+      <w:tr>
+        <w:trPr>
+          <w:cantSplit/>
+          <w:tblHeader/>
+        </w:trPr>
+        <w:tc>
+          <w:tcPr>
+            <w:tcW w:type="dxa" w:w="2200"/>
+            <w:shd w:fill="4E1230" w:color="auto" w:val="clear"/>
+            <w:tcMar>
+              <w:top w:type="dxa" w:w="60"/>
+              <w:left w:type="dxa" w:w="110"/>
+              <w:bottom w:type="dxa" w:w="60"/>
+              <w:right w:type="dxa" w:w="110"/>
+            </w:tcMar>
+            <w:vAlign w:val="center"/>
+          </w:tcPr>
+          <w:p>
+            <w:pPr>
+              <w:spacing w:after="40" w:before="40" w:line="240"/>
+              <w:jc w:val="left"/>
+            </w:pPr>
+            <w:r>
+              <w:rPr>
+                <w:b/>
+                <w:bCs/>
+                <w:color w:val="FFFFFF"/>
+                <w:sz w:val="18"/>
+                <w:szCs w:val="18"/>
+              </w:rPr>
+              <w:t xml:space="preserve">Maior</w:t>
+            </w:r>
+          </w:p>
+        </w:tc>
+        <w:tc>
+          <w:tcPr>
+            <w:tcW w:type="dxa" w:w="6800"/>
+            <w:shd w:fill="4E1230" w:color="auto" w:val="clear"/>
+            <w:tcMar>
+              <w:top w:type="dxa" w:w="60"/>
+              <w:left w:type="dxa" w:w="110"/>
+              <w:bottom w:type="dxa" w:w="60"/>
+              <w:right w:type="dxa" w:w="110"/>
+            </w:tcMar>
+            <w:vAlign w:val="center"/>
+          </w:tcPr>
+          <w:p>
+            <w:pPr>
+              <w:spacing w:after="40" w:before="40" w:line="240"/>
+              <w:jc w:val="center"/>
+            </w:pPr>
+            <w:r>
+              <w:rPr>
+                <w:b/>
+                <w:bCs/>
+                <w:color w:val="FFFFFF"/>
+                <w:sz w:val="18"/>
+                <w:szCs w:val="18"/>
+              </w:rPr>
+              <w:t xml:space="preserve">O que faz</w:t>
+            </w:r>
+          </w:p>
+        </w:tc>
+      </w:tr>
+      <w:tr>
+        <w:trPr>
+          <w:cantSplit/>
+        </w:trPr>
+        <w:tc>
+          <w:tcPr>
+            <w:tcW w:type="dxa" w:w="2200"/>
+            <w:tcMar>
+              <w:top w:type="dxa" w:w="60"/>
+              <w:left w:type="dxa" w:w="110"/>
+              <w:bottom w:type="dxa" w:w="60"/>
+              <w:right w:type="dxa" w:w="110"/>
+            </w:tcMar>
+            <w:vAlign w:val="center"/>
+          </w:tcPr>
+          <w:p>
+            <w:pPr>
+              <w:spacing w:after="40" w:before="40" w:line="240"/>
+              <w:jc w:val="left"/>
+            </w:pPr>
+            <w:r>
+              <w:rPr>
+                <w:b/>
+                <w:bCs/>
+                <w:color w:val="1A1A1A"/>
+                <w:sz w:val="19"/>
+                <w:szCs w:val="19"/>
+              </w:rPr>
+              <w:t xml:space="preserve">Amedrontado</w:t>
+            </w:r>
+          </w:p>
+        </w:tc>
+        <w:tc>
+          <w:tcPr>
+            <w:tcW w:type="dxa" w:w="6800"/>
+            <w:tcMar>
+              <w:top w:type="dxa" w:w="60"/>
+              <w:left w:type="dxa" w:w="110"/>
+              <w:bottom w:type="dxa" w:w="60"/>
+              <w:right w:type="dxa" w:w="110"/>
+            </w:tcMar>
+            <w:vAlign w:val="center"/>
+          </w:tcPr>
+          <w:p>
+            <w:pPr>
+              <w:spacing w:after="40" w:before="40" w:line="240"/>
+              <w:jc w:val="left"/>
+            </w:pPr>
+            <w:r>
+              <w:rPr>
+                <w:b w:val="false"/>
+                <w:bCs w:val="false"/>
+                <w:color w:val="1A1A1A"/>
+                <w:sz w:val="19"/>
+                <w:szCs w:val="19"/>
+              </w:rPr>
+              <w:t xml:space="preserve">Desvantagem em ataque e teste enquanto enxergar a fonte do medo, e você não se aproxima dela de vontade própria.</w:t>
+            </w:r>
+          </w:p>
+        </w:tc>
+      </w:tr>
+      <w:tr>
+        <w:trPr>
+          <w:cantSplit/>
+        </w:trPr>
+        <w:tc>
+          <w:tcPr>
+            <w:tcW w:type="dxa" w:w="2200"/>
+            <w:shd w:fill="F7F4F6" w:color="auto" w:val="clear"/>
+            <w:tcMar>
+              <w:top w:type="dxa" w:w="60"/>
+              <w:left w:type="dxa" w:w="110"/>
+              <w:bottom w:type="dxa" w:w="60"/>
+              <w:right w:type="dxa" w:w="110"/>
+            </w:tcMar>
+            <w:vAlign w:val="center"/>
+          </w:tcPr>
+          <w:p>
+            <w:pPr>
+              <w:spacing w:after="40" w:before="40" w:line="240"/>
+              <w:jc w:val="left"/>
+            </w:pPr>
+            <w:r>
+              <w:rPr>
+                <w:b/>
+                <w:bCs/>
+                <w:color w:val="1A1A1A"/>
+                <w:sz w:val="19"/>
+                <w:szCs w:val="19"/>
+              </w:rPr>
+              <w:t xml:space="preserve">Enfeitiçado</w:t>
+            </w:r>
+          </w:p>
+        </w:tc>
+        <w:tc>
+          <w:tcPr>
+            <w:tcW w:type="dxa" w:w="6800"/>
+            <w:shd w:fill="F7F4F6" w:color="auto" w:val="clear"/>
+            <w:tcMar>
+              <w:top w:type="dxa" w:w="60"/>
+              <w:left w:type="dxa" w:w="110"/>
+              <w:bottom w:type="dxa" w:w="60"/>
+              <w:right w:type="dxa" w:w="110"/>
+            </w:tcMar>
+            <w:vAlign w:val="center"/>
+          </w:tcPr>
+          <w:p>
+            <w:pPr>
+              <w:spacing w:after="40" w:before="40" w:line="240"/>
+              <w:jc w:val="left"/>
+            </w:pPr>
+            <w:r>
+              <w:rPr>
+                <w:b w:val="false"/>
+                <w:bCs w:val="false"/>
+                <w:color w:val="1A1A1A"/>
+                <w:sz w:val="19"/>
+                <w:szCs w:val="19"/>
+              </w:rPr>
+              <w:t xml:space="preserve">Você não ataca quem enfeitiçou nem mira efeito nocivo nele, e ele tem vantagem em teste social contra você.</w:t>
+            </w:r>
+          </w:p>
+        </w:tc>
+      </w:tr>
+      <w:tr>
+        <w:trPr>
+          <w:cantSplit/>
+        </w:trPr>
+        <w:tc>
+          <w:tcPr>
+            <w:tcW w:type="dxa" w:w="2200"/>
+            <w:tcMar>
+              <w:top w:type="dxa" w:w="60"/>
+              <w:left w:type="dxa" w:w="110"/>
+              <w:bottom w:type="dxa" w:w="60"/>
+              <w:right w:type="dxa" w:w="110"/>
+            </w:tcMar>
+            <w:vAlign w:val="center"/>
+          </w:tcPr>
+          <w:p>
+            <w:pPr>
+              <w:spacing w:after="40" w:before="40" w:line="240"/>
+              <w:jc w:val="left"/>
+            </w:pPr>
+            <w:r>
+              <w:rPr>
+                <w:b/>
+                <w:bCs/>
+                <w:color w:val="1A1A1A"/>
+                <w:sz w:val="19"/>
+                <w:szCs w:val="19"/>
+              </w:rPr>
+              <w:t xml:space="preserve">Atordoado</w:t>
+            </w:r>
+          </w:p>
+        </w:tc>
+        <w:tc>
+          <w:tcPr>
+            <w:tcW w:type="dxa" w:w="6800"/>
+            <w:tcMar>
+              <w:top w:type="dxa" w:w="60"/>
+              <w:left w:type="dxa" w:w="110"/>
+              <w:bottom w:type="dxa" w:w="60"/>
+              <w:right w:type="dxa" w:w="110"/>
+            </w:tcMar>
+            <w:vAlign w:val="center"/>
+          </w:tcPr>
+          <w:p>
+            <w:pPr>
+              <w:spacing w:after="40" w:before="40" w:line="240"/>
+              <w:jc w:val="left"/>
+            </w:pPr>
+            <w:r>
+              <w:rPr>
+                <w:b w:val="false"/>
+                <w:bCs w:val="false"/>
+                <w:color w:val="1A1A1A"/>
+                <w:sz w:val="19"/>
+                <w:szCs w:val="19"/>
+              </w:rPr>
+              <w:t xml:space="preserve">Você perde a Ação Padrão e não usa reação. Quem tem mais de uma Ação Padrão no turno perde UMA, não todas.</w:t>
+            </w:r>
+          </w:p>
+        </w:tc>
+      </w:tr>
+      <w:tr>
+        <w:trPr>
+          <w:cantSplit/>
+        </w:trPr>
+        <w:tc>
+          <w:tcPr>
+            <w:tcW w:type="dxa" w:w="2200"/>
+            <w:shd w:fill="F7F4F6" w:color="auto" w:val="clear"/>
+            <w:tcMar>
+              <w:top w:type="dxa" w:w="60"/>
+              <w:left w:type="dxa" w:w="110"/>
+              <w:bottom w:type="dxa" w:w="60"/>
+              <w:right w:type="dxa" w:w="110"/>
+            </w:tcMar>
+            <w:vAlign w:val="center"/>
+          </w:tcPr>
+          <w:p>
+            <w:pPr>
+              <w:spacing w:after="40" w:before="40" w:line="240"/>
+              <w:jc w:val="left"/>
+            </w:pPr>
+            <w:r>
+              <w:rPr>
+                <w:b/>
+                <w:bCs/>
+                <w:color w:val="1A1A1A"/>
+                <w:sz w:val="19"/>
+                <w:szCs w:val="19"/>
+              </w:rPr>
+              <w:t xml:space="preserve">Incapacitado</w:t>
+            </w:r>
+          </w:p>
+        </w:tc>
+        <w:tc>
+          <w:tcPr>
+            <w:tcW w:type="dxa" w:w="6800"/>
+            <w:shd w:fill="F7F4F6" w:color="auto" w:val="clear"/>
+            <w:tcMar>
+              <w:top w:type="dxa" w:w="60"/>
+              <w:left w:type="dxa" w:w="110"/>
+              <w:bottom w:type="dxa" w:w="60"/>
+              <w:right w:type="dxa" w:w="110"/>
+            </w:tcMar>
+            <w:vAlign w:val="center"/>
+          </w:tcPr>
+          <w:p>
+            <w:pPr>
+              <w:spacing w:after="40" w:before="40" w:line="240"/>
+              <w:jc w:val="left"/>
+            </w:pPr>
+            <w:r>
+              <w:rPr>
+                <w:b w:val="false"/>
+                <w:bCs w:val="false"/>
+                <w:color w:val="1A1A1A"/>
+                <w:sz w:val="19"/>
+                <w:szCs w:val="19"/>
+              </w:rPr>
+              <w:t xml:space="preserve">Você não pode Bloquear, e todo ataque corpo a corpo contra você é crítico.</w:t>
+            </w:r>
+          </w:p>
+        </w:tc>
+      </w:tr>
+      <w:tr>
+        <w:trPr>
+          <w:cantSplit/>
+        </w:trPr>
+        <w:tc>
+          <w:tcPr>
+            <w:tcW w:type="dxa" w:w="2200"/>
+            <w:tcMar>
+              <w:top w:type="dxa" w:w="60"/>
+              <w:left w:type="dxa" w:w="110"/>
+              <w:bottom w:type="dxa" w:w="60"/>
+              <w:right w:type="dxa" w:w="110"/>
+            </w:tcMar>
+            <w:vAlign w:val="center"/>
+          </w:tcPr>
+          <w:p>
+            <w:pPr>
+              <w:spacing w:after="40" w:before="40" w:line="240"/>
+              <w:jc w:val="left"/>
+            </w:pPr>
+            <w:r>
+              <w:rPr>
+                <w:b/>
+                <w:bCs/>
+                <w:color w:val="1A1A1A"/>
+                <w:sz w:val="19"/>
+                <w:szCs w:val="19"/>
+              </w:rPr>
+              <w:t xml:space="preserve">Petrificado</w:t>
+            </w:r>
+          </w:p>
+        </w:tc>
+        <w:tc>
+          <w:tcPr>
+            <w:tcW w:type="dxa" w:w="6800"/>
+            <w:tcMar>
+              <w:top w:type="dxa" w:w="60"/>
+              <w:left w:type="dxa" w:w="110"/>
+              <w:bottom w:type="dxa" w:w="60"/>
+              <w:right w:type="dxa" w:w="110"/>
+            </w:tcMar>
+            <w:vAlign w:val="center"/>
+          </w:tcPr>
+          <w:p>
+            <w:pPr>
+              <w:spacing w:after="40" w:before="40" w:line="240"/>
+              <w:jc w:val="left"/>
+            </w:pPr>
+            <w:r>
+              <w:rPr>
+                <w:b w:val="false"/>
+                <w:bCs w:val="false"/>
+                <w:color w:val="1A1A1A"/>
+                <w:sz w:val="19"/>
+                <w:szCs w:val="19"/>
+              </w:rPr>
+              <w:t xml:space="preserve">Virou pedra. Incapacitado, deslocamento 0, sem perceber o que está em volta, vantagem para quem te ataca — e resistência a todo dano.</w:t>
+            </w:r>
+          </w:p>
+        </w:tc>
+      </w:tr>
+    </w:tbl>
+    <w:tbl>
+      <w:tblPr>
+        <w:tblW w:type="dxa" w:w="9000"/>
+        <w:tblBorders>
+          <w:top w:val="nil"/>
+          <w:left w:val="nil"/>
+          <w:bottom w:val="nil"/>
+          <w:right w:val="nil"/>
+          <w:insideH w:val="nil"/>
+          <w:insideV w:val="nil"/>
+        </w:tblBorders>
+      </w:tblPr>
+      <w:tblGrid>
+        <w:gridCol w:w="9000"/>
+      </w:tblGrid>
+      <w:tr>
+        <w:trPr>
+          <w:cantSplit/>
+        </w:trPr>
+        <w:tc>
+          <w:tcPr>
+            <w:tcW w:type="dxa" w:w="9000"/>
+            <w:tcBorders>
+              <w:top w:val="nil"/>
+              <w:left w:val="single" w:color="4E1230" w:sz="18"/>
+              <w:bottom w:val="nil"/>
+              <w:right w:val="nil"/>
+            </w:tcBorders>
+            <w:shd w:fill="F4F1EC" w:color="auto" w:val="clear"/>
+            <w:tcMar>
+              <w:top w:type="dxa" w:w="160"/>
+              <w:left w:type="dxa" w:w="220"/>
+              <w:bottom w:type="dxa" w:w="160"/>
+              <w:right w:type="dxa" w:w="220"/>
+            </w:tcMar>
+          </w:tcPr>
+          <w:p>
+            <w:pPr>
+              <w:spacing w:after="100" w:before="20"/>
+            </w:pPr>
+            <w:r>
+              <w:rPr>
+                <w:rFonts w:ascii="Georgia" w:cs="Georgia" w:eastAsia="Georgia" w:hAnsi="Georgia"/>
+                <w:b/>
+                <w:bCs/>
+                <w:color w:val="4E1230"/>
+                <w:sz w:val="18"/>
+                <w:szCs w:val="18"/>
+              </w:rPr>
+              <w:t xml:space="preserve">ATORDOADO E INCAPACITADO ATACAM EIXOS DIFERENTES, E NÃO SE EMPILHAM</w:t>
+            </w:r>
+          </w:p>
+          <w:p>
+            <w:pPr>
+              <w:spacing w:after="110" w:line="268"/>
+            </w:pPr>
+            <w:r>
+              <w:rPr>
+                <w:sz w:val="20"/>
+                <w:szCs w:val="20"/>
+              </w:rPr>
+              <w:t xml:space="preserve">Atordoado tira PARTE do turno: uma Ação Padrão e a reação. Você continua se defendendo.</w:t>
+            </w:r>
+          </w:p>
+          <w:p>
+            <w:pPr>
+              <w:spacing w:after="110" w:line="268"/>
+            </w:pPr>
+            <w:r>
+              <w:rPr>
+                <w:sz w:val="20"/>
+                <w:szCs w:val="20"/>
+              </w:rPr>
+              <w:t xml:space="preserve">Incapacitado não tira turno nenhum — tira a DEFESA. Você age e não se protege.</w:t>
+            </w:r>
+          </w:p>
+          <w:p>
+            <w:pPr>
+              <w:spacing w:after="110" w:line="268"/>
+            </w:pPr>
+            <w:r>
+              <w:rPr>
+                <w:sz w:val="20"/>
+                <w:szCs w:val="20"/>
+              </w:rPr>
+              <w:t xml:space="preserve">Uma Condição Maior custa Pesada e você escolhe o eixo: tirar o que ele faz, ou tirar o que protege ele.</w:t>
+            </w:r>
+          </w:p>
+          <w:p>
+            <w:pPr>
+              <w:spacing w:after="20" w:line="268"/>
+            </w:pPr>
+            <w:r>
+              <w:rPr>
+                <w:sz w:val="20"/>
+                <w:szCs w:val="20"/>
+              </w:rPr>
+              <w:t xml:space="preserve">O Atordoado cobra uma Ação Padrão só de propósito: um chefe age mais de uma vez por rodada, e apagar o turno dele com uma linha de Controle sairia barato demais.</w:t>
+            </w:r>
+          </w:p>
+        </w:tc>
+      </w:tr>
+    </w:tbl>
+    <w:tbl>
+      <w:tblPr>
+        <w:tblW w:type="dxa" w:w="9000"/>
+        <w:tblBorders>
+          <w:top w:val="nil"/>
+          <w:left w:val="nil"/>
+          <w:bottom w:val="nil"/>
+          <w:right w:val="nil"/>
+          <w:insideH w:val="nil"/>
+          <w:insideV w:val="nil"/>
+        </w:tblBorders>
+      </w:tblPr>
+      <w:tblGrid>
+        <w:gridCol w:w="9000"/>
+      </w:tblGrid>
+      <w:tr>
+        <w:trPr>
+          <w:cantSplit/>
+        </w:trPr>
+        <w:tc>
+          <w:tcPr>
+            <w:tcW w:type="dxa" w:w="9000"/>
+            <w:tcBorders>
+              <w:top w:val="nil"/>
+              <w:left w:val="single" w:color="741B47" w:sz="18"/>
+              <w:bottom w:val="nil"/>
+              <w:right w:val="nil"/>
+            </w:tcBorders>
+            <w:shd w:fill="F7E9F1" w:color="auto" w:val="clear"/>
+            <w:tcMar>
+              <w:top w:type="dxa" w:w="160"/>
+              <w:left w:type="dxa" w:w="220"/>
+              <w:bottom w:type="dxa" w:w="160"/>
+              <w:right w:type="dxa" w:w="220"/>
+            </w:tcMar>
+          </w:tcPr>
+          <w:p>
+            <w:pPr>
+              <w:spacing w:after="100" w:before="20"/>
+            </w:pPr>
+            <w:r>
+              <w:rPr>
+                <w:rFonts w:ascii="Georgia" w:cs="Georgia" w:eastAsia="Georgia" w:hAnsi="Georgia"/>
+                <w:b/>
+                <w:bCs/>
+                <w:color w:val="741B47"/>
+                <w:sz w:val="18"/>
+                <w:szCs w:val="18"/>
+              </w:rPr>
+              <w:t xml:space="preserve">TRÊS COISAS QUE NÃO SÃO CONDIÇÃO AQUI</w:t>
+            </w:r>
+          </w:p>
+          <w:p>
+            <w:pPr>
+              <w:spacing w:after="110" w:line="268"/>
+            </w:pPr>
+            <w:r>
+              <w:rPr>
+                <w:sz w:val="20"/>
+                <w:szCs w:val="20"/>
+              </w:rPr>
+              <w:t xml:space="preserve">Inconsciente é cair morrendo, e tem regra própria no sistema em volta — não é efeito de uma rodada.</w:t>
+            </w:r>
+          </w:p>
+          <w:p>
+            <w:pPr>
+              <w:spacing w:after="110" w:line="268"/>
+            </w:pPr>
+            <w:r>
+              <w:rPr>
+                <w:sz w:val="20"/>
+                <w:szCs w:val="20"/>
+              </w:rPr>
+              <w:t xml:space="preserve">Exaustão é relógio de descanso, e Condição Menor não alcança ela.</w:t>
+            </w:r>
+          </w:p>
+          <w:p>
+            <w:pPr>
+              <w:spacing w:after="20" w:line="268"/>
+            </w:pPr>
+            <w:r>
+              <w:rPr>
+                <w:sz w:val="20"/>
+                <w:szCs w:val="20"/>
+              </w:rPr>
+              <w:t xml:space="preserve">Invisível é benefício: comprar para aplicar num inimigo é pagar para ajudar ele.</w:t>
             </w:r>
           </w:p>
         </w:tc>
@@ -40744,7 +42001,7 @@
                 <w:sz w:val="19"/>
                 <w:szCs w:val="19"/>
               </w:rPr>
-              <w:t xml:space="preserve">Explosão (−2) · Paralisado (−5) · Terreno (−2)</w:t>
+              <w:t xml:space="preserve">Explosão (−2) · Atordoado (−5) · Terreno (−2)</w:t>
             </w:r>
           </w:p>
         </w:tc>
@@ -40772,7 +42029,7 @@
                 <w:sz w:val="19"/>
                 <w:szCs w:val="19"/>
               </w:rPr>
-              <w:t xml:space="preserve">zero dano: Paralisado + terreno difícil, CD +2, tudo durando uma rodada a mais</w:t>
+              <w:t xml:space="preserve">zero dano: Atordoado + terreno difícil, CD +2, tudo durando uma rodada a mais</w:t>
             </w:r>
           </w:p>
         </w:tc>
@@ -41142,7 +42399,7 @@
                 <w:sz w:val="19"/>
                 <w:szCs w:val="19"/>
               </w:rPr>
-              <w:t xml:space="preserve">Explosão (−2) · Paralisado (−6) · Escolher (−4) · Sangra (+4)</w:t>
+              <w:t xml:space="preserve">Explosão (−2) · Atordoado (−6) · Escolher (−4) · Sangra (+4)</w:t>
             </w:r>
           </w:p>
         </w:tc>
@@ -41170,7 +42427,7 @@
                 <w:sz w:val="19"/>
                 <w:szCs w:val="19"/>
               </w:rPr>
-              <w:t xml:space="preserve">4d8 = 18 + Paralisado durando uma rodada a mais; você toma 8</w:t>
+              <w:t xml:space="preserve">4d8 = 18 + Atordoado durando uma rodada a mais; você toma 8</w:t>
             </w:r>
           </w:p>
         </w:tc>

</xml_diff>

<commit_message>
v0.162 — a cobertura do manual falava GURPS e D&D 2014 dentro de um sistema que usa a escada de 2024
</commit_message>
<xml_diff>
--- a/manual/Fundamento-MANUAL-v7.docx
+++ b/manual/Fundamento-MANUAL-v7.docx
@@ -70,7 +70,7 @@
           <w:sz w:val="20"/>
           <w:szCs w:val="20"/>
         </w:rPr>
-        <w:t xml:space="preserve">Níveis 1–20  ·  Faixa lendária 21–30  ·  Versão 7.15</w:t>
+        <w:t xml:space="preserve">Níveis 1–20  ·  Faixa lendária 21–30  ·  Versão 7.16</w:t>
       </w:r>
     </w:p>
     <w:p>
@@ -14022,7 +14022,7 @@
                 <w:sz w:val="19"/>
                 <w:szCs w:val="19"/>
               </w:rPr>
-              <w:t xml:space="preserve">Escolha um tema da sua Regra. Feitiços daquele tema ignoram cobertura leve e resistência ao seu tipo de dano.</w:t>
+              <w:t xml:space="preserve">Escolha um tema da sua Regra. Feitiços daquele tema ignoram cobertura Parcial e resistência ao seu tipo de dano.</w:t>
             </w:r>
           </w:p>
         </w:tc>
@@ -24041,7 +24041,7 @@
                 <w:sz w:val="19"/>
                 <w:szCs w:val="19"/>
               </w:rPr>
-              <w:t xml:space="preserve">Cobertura leve e meia cobertura não atrapalham.</w:t>
+              <w:t xml:space="preserve">Cobertura Parcial não atrapalha. A Total não se fura: ela não é bônus, é a ausência de alvo legal.</w:t>
             </w:r>
           </w:p>
         </w:tc>

</xml_diff>